<commit_message>
feat: refocus dashboard visuals on learning outcome insights
</commit_message>
<xml_diff>
--- a/docs/TTDLTQ_script.docx
+++ b/docs/TTDLTQ_script.docx
@@ -175,7 +175,7 @@
         <w:spacing w:after="40" w:line="264" w:lineRule="auto"/>
       </w:pPr>
       <w:r>
-        <w:t>Trực quan hóa bằng Dashboard Python Streamlit + Plotly có Filter, Drill-down, Cross-filter, Geographic Map, Story và danh sách hỗ trợ.</w:t>
+        <w:t>Trực quan hóa bằng Dashboard Python Streamlit + Plotly có Filter, Drill-down, Cross-filter, Geographic Map, Story và phân tích yếu tố ở cấp nhóm.</w:t>
       </w:r>
     </w:p>
     <w:p>
@@ -1976,7 +1976,7 @@
     </w:p>
     <w:p>
       <w:r>
-        <w:t>Đơn vị phân tích là một sinh viên trong một code_module × code_presentation. OULAD là dữ liệu quan sát của Open University tại Vương quốc Anh; các kết luận dùng từ liên quan/đi cùng/khác biệt, không tuyên bố nhân quả.</w:t>
+        <w:t>Đơn vị phân tích là một lượt đăng ký học; một sinh viên có thể xuất hiện nhiều lần. OULAD là dữ liệu quan sát của Open University tại Vương quốc Anh; các kết luận dùng từ liên quan/đi cùng/khác biệt, không tuyên bố nhân quả.</w:t>
       </w:r>
     </w:p>
     <w:p>
@@ -2024,7 +2024,7 @@
         <w:pStyle w:val="ListNumber"/>
       </w:pPr>
       <w:r>
-        <w:t>Kết quả khác nhau thế nào giữa module, presentation và vùng?</w:t>
+        <w:t>Cơ cấu kết quả tổng thể ra sao và khác nhau thế nào theo học vấn đầu vào, vùng và các nhóm người học?</w:t>
       </w:r>
     </w:p>
     <w:p>
@@ -2124,7 +2124,7 @@
           </w:tcPr>
           <w:p>
             <w:r>
-              <w:t>GGG-2013J Fail 30,88% so với AAA-2013J 11,75%.</w:t>
+              <w:t>Không có bằng cấp chính quy Fail 27,38%; sau đại học 10,86%.</w:t>
             </w:r>
           </w:p>
         </w:tc>
@@ -2663,7 +2663,7 @@
         <w:pStyle w:val="ListBullet"/>
       </w:pPr>
       <w:r>
-        <w:t>Có 246 False Negative và 277 False Positive; model dùng để ưu tiên hỗ trợ, không tự động xử phạt hay quyết định kết quả.</w:t>
+        <w:t>Có 246 False Negative và 277 False Positive; các sai số này được dùng để đánh giá độ tin cậy trước khi diễn giải yếu tố ở cấp nhóm.</w:t>
       </w:r>
     </w:p>
     <w:p>
@@ -2723,7 +2723,7 @@
           </w:tcPr>
           <w:p>
             <w:r>
-              <w:t>KPI, Geographic Filled Map tỷ lệ Fail, 100% stacked bar có drill, histogram điểm quá trình.</w:t>
+              <w:t>KPI, 100% stacked bar tổng thể/drill học vấn, Geographic Map tỷ lệ Fail và violin điểm theo kết quả.</w:t>
             </w:r>
           </w:p>
         </w:tc>
@@ -2745,7 +2745,7 @@
           </w:tcPr>
           <w:p>
             <w:r>
-              <w:t>VLE line, completion bar, submission-delay scatter + trendline, resource treemap.</w:t>
+              <w:t>VLE line, completion bar, submission-delay scatter + trendline và grouped bar tài nguyên theo kết quả.</w:t>
             </w:r>
           </w:p>
         </w:tc>
@@ -2779,7 +2779,7 @@
           </w:tcPr>
           <w:p>
             <w:r>
-              <w:t>Trang 4 – Cảnh báo giữa khóa</w:t>
+              <w:t>Trang 4 – Mô hình và yếu tố dự báo</w:t>
             </w:r>
           </w:p>
         </w:tc>
@@ -2789,7 +2789,7 @@
           </w:tcPr>
           <w:p>
             <w:r>
-              <w:t>Accuracy/Recall/High count, gauge, TP/TN/FP/FN donut, bar hệ số và Action List.</w:t>
+              <w:t>Accuracy/Recall/Precision, xác suất dự báo so với Fail thật, confusion matrix và bar hệ số.</w:t>
             </w:r>
           </w:p>
         </w:tc>
@@ -2808,7 +2808,7 @@
         <w:pStyle w:val="ListBullet"/>
       </w:pPr>
       <w:r>
-        <w:t>Filter, drill-down, tooltip và map cross-filter hoạt động; màu đỏ cho Fail/cảnh báo và xanh cho Pass/Distinction.</w:t>
+        <w:t>Filter theo đặc điểm người học, drill từ tổng thể xuống học vấn đầu vào, tooltip và map cross-filter hoạt động; màu đỏ cho Fail/cảnh báo và xanh cho Pass/Distinction.</w:t>
       </w:r>
     </w:p>
     <w:p>
@@ -2824,7 +2824,7 @@
         <w:pStyle w:val="ListBullet"/>
       </w:pPr>
       <w:r>
-        <w:t>VLE, IMD, mã AAA–GGG, B/J, Recall và bỏ sót được giải thích ngay trên giao diện.</w:t>
+        <w:t>VLE, IMD, Distinction, Recall và bỏ sót được giải thích ngay trên giao diện.</w:t>
       </w:r>
     </w:p>
     <w:p>
@@ -2864,7 +2864,7 @@
         <w:pStyle w:val="ListNumber"/>
       </w:pPr>
       <w:r>
-        <w:t>Cảnh báo giữa khóa: Logistic Regression ước lượng xác suất Fail và chỉ ra nhóm cần ưu tiên.</w:t>
+        <w:t>Cảnh báo giữa khóa: Logistic Regression ước lượng xác suất Fail, kiểm tra dự báo với kết quả thật và chỉ ra tín hiệu liên quan.</w:t>
       </w:r>
     </w:p>
     <w:p>
@@ -2932,7 +2932,7 @@
           </w:tcPr>
           <w:p>
             <w:r>
-              <w:t>17/17 PASS</w:t>
+              <w:t>19/19 PASS</w:t>
             </w:r>
           </w:p>
         </w:tc>
@@ -3101,7 +3101,7 @@
         <w:pStyle w:val="ListBullet"/>
       </w:pPr>
       <w:r>
-        <w:t>Mọi thay đổi hiện chỉ ở local. Không commit/push cho đến khi leader cung cấp repo mới và duyệt.</w:t>
+        <w:t>Bản nền đã có trên repo ttdltq_oulad; mọi thay đổi mới chỉ commit/push sau khi leader duyệt.</w:t>
       </w:r>
     </w:p>
     <w:p>

</xml_diff>